<commit_message>
Adopter SMART BUG comme appellation finale du modèle
Retirer le suffixe de version des modules, configurations et dossiers du
modèle. Adapter les imports, les chemins et l'interface au nom SMART BUG.
Actualiser les rapports, les six figures et la synthèse Word/PDF.

Migrer explicitement les métadonnées et leurs empreintes avec une référence
au commit d'origine. Conserver les poids numériques, les données et les
résultats ; aucun réentraînement n'est effectué.

Validation : 32 tests réussis, audit des 18 238 exemples, 232 fichiers
numériques et résultats identiques, poids des trois archives Keras identiques,
contrôles de reprise comparative et empreintes des sources Git vérifiés.
</commit_message>
<xml_diff>
--- a/output/documents/Synthese_memoire_SmartContractSecurity.docx
+++ b/output/documents/Synthese_memoire_SmartContractSecurity.docx
@@ -126,7 +126,7 @@
     </w:p>
     <w:p>
       <w:r>
-        <w:t>Le travail repose sur une classification binaire supervisée. Il ne vise ni à démontrer formellement l’absence de vulnérabilité ni à localiser avec certitude une ligne fautive. Les résultats sont interprétés comme des observations expérimentales sur les données retenues. Le test V3 ayant déjà été consulté au cours du développement, la comparaison conserve un caractère exploratoire et nécessite une confirmation indépendante.</w:t>
+        <w:t>Le travail repose sur une classification binaire supervisée. Il ne vise ni à démontrer formellement l’absence de vulnérabilité ni à localiser avec certitude une ligne fautive. Les résultats sont interprétés comme des observations expérimentales sur les données retenues. Le test SMART BUG ayant déjà été consulté au cours du développement, la comparaison conserve un caractère exploratoire et nécessite une confirmation indépendante.</w:t>
       </w:r>
     </w:p>
     <w:p>
@@ -221,7 +221,7 @@
     </w:p>
     <w:p>
       <w:r>
-        <w:t>La démarche combine une analyse des travaux existants et une expérimentation reproductible. Les premières vérifications du projet ont mis en évidence des risques liés aux doublons, aux annotations contradictoires et à la troncature du code. Le protocole V3 a donc été construit pour améliorer la préparation des données et séparer explicitement les différentes étapes d’apprentissage et d’évaluation.</w:t>
+        <w:t>La démarche combine une analyse des travaux existants et une expérimentation reproductible. Les premières vérifications du projet ont mis en évidence des risques liés aux doublons, aux annotations contradictoires et à la troncature du code. Le protocole SMART BUG a donc été construit pour améliorer la préparation des données et séparer explicitement les différentes étapes d’apprentissage et d’évaluation.</w:t>
       </w:r>
     </w:p>
     <w:p>
@@ -231,7 +231,7 @@
     </w:p>
     <w:p>
       <w:r>
-        <w:t>Le snapshot V3 contient 18 238 exemples répartis entre cinq partitions. Les quatre premières servent au protocole principal ; la cinquième réserve une source afin d’examiner le comportement du système sur une provenance différente. Les partitions sont identiques pour toutes les variantes comparées [5].</w:t>
+        <w:t>Le snapshot SMART BUG contient 18 238 exemples répartis entre cinq partitions. Les quatre premières servent au protocole principal ; la cinquième réserve une source afin d’examiner le comportement du système sur une provenance différente. Les partitions sont identiques pour toutes les variantes comparées [5].</w:t>
       </w:r>
     </w:p>
     <w:tbl>
@@ -748,12 +748,12 @@
     </w:p>
     <w:p>
       <w:r>
-        <w:t>La mise en œuvre est une expérimentation sur des contrats annotés, et non la simulation d’un réseau blockchain. Elle comprend 18 entraînements depuis zéro, six entraînements de têtes CodeT5 et deux ajustements TF-IDF, soit 26 exécutions. Les nouvelles variantes neuronales sont entraînées sous PyTorch sur CPU. L’application SMART BUG conserve son modèle V3 TensorFlow actif ; les essais comparatifs ne l’ont pas remplacé.</w:t>
+        <w:t>La mise en œuvre est une expérimentation sur des contrats annotés, et non la simulation d’un réseau blockchain. Elle comprend 18 entraînements depuis zéro, six entraînements de têtes CodeT5 et deux ajustements TF-IDF, soit 26 exécutions. Les nouvelles variantes neuronales sont entraînées sous PyTorch sur CPU. L’application SMART BUG conserve son modèle TensorFlow actif ; les essais comparatifs ne l’ont pas remplacé.</w:t>
       </w:r>
     </w:p>
     <w:p>
       <w:r>
-        <w:t>L’application permet de soumettre du code Solidity et d’obtenir une prédiction issue de la chaîne d’inférence. Les tests du projet vérifient notamment le masquage, la conservation de la fin des contrats, la restauration des checkpoints et l’intégration de la prédiction à l’API. Les 34 tests exécutés passent. Les empreintes des 26 modèles et l’alignement des prédictions avec les labels ont également été contrôlés.</w:t>
+        <w:t>L’application permet de soumettre du code Solidity et d’obtenir une prédiction issue de la chaîne d’inférence. Les tests du projet vérifient notamment le masquage, la conservation de la fin des contrats, la restauration des checkpoints et l’intégration de la prédiction à l’API. Les 32 tests actuels passent. Les empreintes des 26 modèles et l’alignement des prédictions avec les labels ont également été contrôlés.</w:t>
       </w:r>
     </w:p>
     <w:p>
@@ -766,7 +766,7 @@
     </w:p>
     <w:p>
       <w:r>
-        <w:t>Le tableau présente les résultats sur le test V3 déjà consulté, pour les variantes à code complet. Les réseaux sont résumés par la moyenne sur trois graines ; TF-IDF correspond à un seul ajustement. Les seuils sont fixés sur calibration avec une cible de rappel de 90 % [5].</w:t>
+        <w:t>Le tableau présente les résultats sur le test SMART BUG déjà consulté, pour les variantes à code complet. Les réseaux sont résumés par la moyenne sur trois graines ; TF-IDF correspond à un seul ajustement. Les seuils sont fixés sur calibration avec une cible de rappel de 90 % [5].</w:t>
       </w:r>
     </w:p>
     <w:tbl>
@@ -1474,7 +1474,7 @@
     </w:p>
     <w:p>
       <w:r>
-        <w:t>Le test V3 ayant déjà été consulté, l’évaluation est exploratoire. Par ailleurs, la troncature introduit des préfixes identiques pour 386 exemples du test par rapport à au moins une partition d’entraînement, de validation ou de calibration. Un diagnostic commun sur les 1 323 exemples sans ces collisions donne un F1 de 84,32 % pour le CNN-BiLSTM complet et de 83,32 % pour CodeT5 complet. Cette restriction ne constitue pas une nouvelle réserve indépendante.</w:t>
+        <w:t>Le test SMART BUG ayant déjà été consulté, l’évaluation est exploratoire. Par ailleurs, la troncature introduit des préfixes identiques pour 386 exemples du test par rapport à au moins une partition d’entraînement, de validation ou de calibration. Un diagnostic commun sur les 1 323 exemples sans ces collisions donne un F1 de 84,32 % pour le CNN-BiLSTM complet et de 83,32 % pour CodeT5 complet. Cette restriction ne constitue pas une nouvelle réserve indépendante.</w:t>
       </w:r>
     </w:p>
     <w:p>
@@ -1517,7 +1517,7 @@
     </w:p>
     <w:p>
       <w:r>
-        <w:t>La contribution réside ainsi dans une réalisation reproductible et une analyse comparée des choix de représentation et de modélisation. Les observations ne justifient pas le remplacement automatique du modèle V3 actuellement actif dans SMART BUG. Elles invitent à conserver le traitement du code complet et à confirmer les résultats sur des contrats indépendants avant toute conclusion générale ou évolution du modèle déployé.</w:t>
+        <w:t>La contribution réside ainsi dans une réalisation reproductible et une analyse comparée des choix de représentation et de modélisation. Les observations ne justifient pas le remplacement automatique du modèle actuellement actif dans SMART BUG. Elles invitent à conserver le traitement du code complet et à confirmer les résultats sur des contrats indépendants avant toute conclusion générale ou évolution du modèle déployé.</w:t>
       </w:r>
     </w:p>
     <w:p>
@@ -1602,7 +1602,7 @@
         <w:spacing w:after="140"/>
       </w:pPr>
       <w:r>
-        <w:t>[5] Projet SMART BUG (2026). Protocole V3 et expérience comparison-v1-20260922 : configurations, audit, résultats et rapport. Dépôt GitHub, commit e7f9ae0. Résultats expérimentaux du présent mémoire.</w:t>
+        <w:t>[5] Projet SMART BUG (2026). Protocole SMART BUG et expérience comparison-v1-20260922 : configurations, audit, résultats et rapport. Dépôt GitHub, commit e7f9ae0. Résultats expérimentaux du présent mémoire.</w:t>
       </w:r>
       <w:hyperlink r:id="rId14">
         <w:r>

</xml_diff>